<commit_message>
Publish scene H264 lab imodule and Docker info
</commit_message>
<xml_diff>
--- a/docs/Minh_chung_scene-h264-stego.docx
+++ b/docs/Minh_chung_scene-h264-stego.docx
@@ -93,13 +93,55 @@
           <w:tab w:val="left" w:pos="709" w:leader="none"/>
         </w:tabs>
         <w:bidi w:val="0"/>
+        <w:spacing w:before="0" w:after="0"/>
         <w:ind w:hanging="283" w:start="709"/>
         <w:jc w:val="start"/>
         <w:rPr/>
       </w:pPr>
       <w:r>
         <w:rPr/>
-        <w:t xml:space="preserve">Huong thuc hien: chon frame ngay sau scene-change, nhung bit bang patch sang/toi nho, encode lai bang H.264 lossless, trich xuat thong diep tu video stego. </w:t>
+        <w:t xml:space="preserve">Docker image: </w:t>
+      </w:r>
+      <w:r>
+        <w:rPr>
+          <w:rStyle w:val="SourceText"/>
+        </w:rPr>
+        <w:t>hoangbac2004/scene-h264-stego.students.student:latest</w:t>
+      </w:r>
+      <w:r>
+        <w:rPr/>
+        <w:t xml:space="preserve"> </w:t>
+      </w:r>
+    </w:p>
+    <w:p>
+      <w:pPr>
+        <w:pStyle w:val="BodyText"/>
+        <w:numPr>
+          <w:ilvl w:val="0"/>
+          <w:numId w:val="1"/>
+        </w:numPr>
+        <w:tabs>
+          <w:tab w:val="clear" w:pos="1134"/>
+          <w:tab w:val="left" w:pos="709" w:leader="none"/>
+        </w:tabs>
+        <w:bidi w:val="0"/>
+        <w:ind w:hanging="283" w:start="709"/>
+        <w:jc w:val="start"/>
+        <w:rPr/>
+      </w:pPr>
+      <w:r>
+        <w:rPr/>
+        <w:t xml:space="preserve">Imodule: </w:t>
+      </w:r>
+      <w:r>
+        <w:rPr>
+          <w:rStyle w:val="SourceText"/>
+        </w:rPr>
+        <w:t>scene-h264-stego-hoangbac2004-imodule.tar</w:t>
+      </w:r>
+      <w:r>
+        <w:rPr/>
+        <w:t xml:space="preserve"> </w:t>
       </w:r>
     </w:p>
     <w:p>
@@ -111,7 +153,56 @@
       </w:pPr>
       <w:r>
         <w:rPr/>
-        <w:t>Lenh chay</w:t>
+        <w:t>Lenh tai va chay</w:t>
+      </w:r>
+    </w:p>
+    <w:p>
+      <w:pPr>
+        <w:pStyle w:val="PreformattedText"/>
+        <w:bidi w:val="0"/>
+        <w:jc w:val="start"/>
+        <w:rPr/>
+      </w:pPr>
+      <w:r>
+        <w:rPr/>
+        <w:t>imodule https://raw.githubusercontent.com/bac-ptit/labtainer/main/scene-h264-stego-hoangbac2004-imodule.tar</w:t>
+      </w:r>
+    </w:p>
+    <w:p>
+      <w:pPr>
+        <w:pStyle w:val="PreformattedText"/>
+        <w:bidi w:val="0"/>
+        <w:jc w:val="start"/>
+        <w:rPr/>
+      </w:pPr>
+      <w:r>
+        <w:rPr/>
+        <w:t>docker pull hoangbac2004/scene-h264-stego.students.student:latest</w:t>
+      </w:r>
+    </w:p>
+    <w:p>
+      <w:pPr>
+        <w:pStyle w:val="PreformattedText"/>
+        <w:bidi w:val="0"/>
+        <w:spacing w:before="0" w:after="283"/>
+        <w:jc w:val="start"/>
+        <w:rPr/>
+      </w:pPr>
+      <w:r>
+        <w:rPr/>
+        <w:t>labtainer -r scene-h264-stego</w:t>
+      </w:r>
+    </w:p>
+    <w:p>
+      <w:pPr>
+        <w:pStyle w:val="Heading2"/>
+        <w:bidi w:val="0"/>
+        <w:jc w:val="start"/>
+        <w:rPr/>
+      </w:pPr>
+      <w:r>
+        <w:rPr/>
+        <w:t>Lenh trong lab</w:t>
       </w:r>
     </w:p>
     <w:p>
@@ -208,66 +299,6 @@
       </w:pPr>
       <w:r>
         <w:rPr/>
-        <w:t>Created cover_h264.mp4 with 180 frames at 12 fps</w:t>
-      </w:r>
-    </w:p>
-    <w:p>
-      <w:pPr>
-        <w:pStyle w:val="PreformattedText"/>
-        <w:bidi w:val="0"/>
-        <w:jc w:val="start"/>
-        <w:rPr/>
-      </w:pPr>
-      <w:r>
-        <w:rPr/>
-        <w:t>Selected scene-change frames: 179</w:t>
-      </w:r>
-    </w:p>
-    <w:p>
-      <w:pPr>
-        <w:pStyle w:val="PreformattedText"/>
-        <w:bidi w:val="0"/>
-        <w:jc w:val="start"/>
-        <w:rPr/>
-      </w:pPr>
-      <w:r>
-        <w:rPr/>
-        <w:t>Message: SCENE_H264_STEGO_OK</w:t>
-      </w:r>
-    </w:p>
-    <w:p>
-      <w:pPr>
-        <w:pStyle w:val="PreformattedText"/>
-        <w:bidi w:val="0"/>
-        <w:jc w:val="start"/>
-        <w:rPr/>
-      </w:pPr>
-      <w:r>
-        <w:rPr/>
-        <w:t>Bits: 152</w:t>
-      </w:r>
-    </w:p>
-    <w:p>
-      <w:pPr>
-        <w:pStyle w:val="PreformattedText"/>
-        <w:bidi w:val="0"/>
-        <w:jc w:val="start"/>
-        <w:rPr/>
-      </w:pPr>
-      <w:r>
-        <w:rPr/>
-        <w:t>Embedded bits: 152</w:t>
-      </w:r>
-    </w:p>
-    <w:p>
-      <w:pPr>
-        <w:pStyle w:val="PreformattedText"/>
-        <w:bidi w:val="0"/>
-        <w:jc w:val="start"/>
-        <w:rPr/>
-      </w:pPr>
-      <w:r>
-        <w:rPr/>
         <w:t>Recovered message: SCENE_H264_STEGO_OK</w:t>
       </w:r>
     </w:p>
@@ -317,7 +348,7 @@
       </w:pPr>
       <w:r>
         <w:rPr/>
-        <w:t>Ket qua pregrade</w:t>
+        <w:t>Pregrade</w:t>
       </w:r>
     </w:p>
     <w:p>
@@ -391,6 +422,43 @@
       <w:r>
         <w:rPr/>
         <w:t>QUALITY_OK</w:t>
+      </w:r>
+    </w:p>
+    <w:p>
+      <w:pPr>
+        <w:pStyle w:val="Heading2"/>
+        <w:bidi w:val="0"/>
+        <w:jc w:val="start"/>
+        <w:rPr/>
+      </w:pPr>
+      <w:r>
+        <w:rPr/>
+        <w:t>Docker push</w:t>
+      </w:r>
+    </w:p>
+    <w:p>
+      <w:pPr>
+        <w:pStyle w:val="PreformattedText"/>
+        <w:bidi w:val="0"/>
+        <w:jc w:val="start"/>
+        <w:rPr/>
+      </w:pPr>
+      <w:r>
+        <w:rPr/>
+        <w:t>docker push hoangbac2004/scene-h264-stego.students.student:latest</w:t>
+      </w:r>
+    </w:p>
+    <w:p>
+      <w:pPr>
+        <w:pStyle w:val="PreformattedText"/>
+        <w:bidi w:val="0"/>
+        <w:spacing w:before="0" w:after="283"/>
+        <w:jc w:val="start"/>
+        <w:rPr/>
+      </w:pPr>
+      <w:r>
+        <w:rPr/>
+        <w:t>latest: digest: sha256:a56d8ca1ccd9877291d750bf52a03decb5199bd4e8bb3365fd81f2abd03fcfa8 size: 7606</w:t>
       </w:r>
     </w:p>
     <w:p>

</xml_diff>